<commit_message>
id cliente google cloud grabado por defecto
</commit_message>
<xml_diff>
--- a/docs/Mail Designia propia.docx
+++ b/docs/Mail Designia propia.docx
@@ -7,7 +7,6 @@
         <w:t>Estimados señores:</w:t>
       </w:r>
     </w:p>
-    <w:p/>
     <w:p>
       <w:r>
         <w:t>Por el presente, le informamos de que hemos sido designados para la reclamación de la indemnización que pudiere corresponder al perjudicado </w:t>
@@ -38,7 +37,6 @@
         <w:t> reclamación que dirigiremos a la aseguradora responsable.</w:t>
       </w:r>
     </w:p>
-    <w:p/>
     <w:p>
       <w:r>
         <w:t>Si bien rogamos que, por su parte, dando cumplimiento al convenio suscrito para daños materiales, se proceda a la </w:t>
@@ -70,7 +68,6 @@
         <w:t>.</w:t>
       </w:r>
     </w:p>
-    <w:p/>
     <w:p>
       <w:r>
         <w:t>Adjuntamos carta designa.</w:t>
@@ -82,7 +79,6 @@
         <w:t>Un saludo</w:t>
       </w:r>
     </w:p>
-    <w:p/>
     <w:p>
       <w:r>
         <w:t>--</w:t>
@@ -162,23 +158,7 @@
           <w:i/>
           <w:iCs/>
         </w:rPr>
-        <w:t xml:space="preserve">Colegiado </w:t>
-      </w:r>
-      <w:proofErr w:type="spellStart"/>
-      <w:r>
-        <w:rPr>
-          <w:i/>
-          <w:iCs/>
-        </w:rPr>
-        <w:t>nº</w:t>
-      </w:r>
-      <w:proofErr w:type="spellEnd"/>
-      <w:r>
-        <w:rPr>
-          <w:i/>
-          <w:iCs/>
-        </w:rPr>
-        <w:t xml:space="preserve"> 4651 - Ilustre Colegio de Abogados de Las Palmas</w:t>
+        <w:t>Colegiado nº 4651 - Ilustre Colegio de Abogados de Las Palmas</w:t>
       </w:r>
     </w:p>
     <w:p/>

</xml_diff>